<commit_message>
extracted time from the sensor data
</commit_message>
<xml_diff>
--- a/iEarProject - Styx/test documentation/client to server communication tests.docx
+++ b/iEarProject - Styx/test documentation/client to server communication tests.docx
@@ -1626,42 +1626,26 @@
                 <w:sz w:val="20"/>
                 <w:szCs w:val="20"/>
               </w:rPr>
-              <w:t xml:space="preserve">Red: </w:t>
-            </w:r>
-            <w:r>
-              <w:rPr>
-                <w:rFonts w:ascii="Times New Roman" w:hAnsi="Times New Roman" w:cs="Times New Roman"/>
-                <w:sz w:val="20"/>
-                <w:szCs w:val="20"/>
-              </w:rPr>
-              <w:t>519</w:t>
-            </w:r>
-          </w:p>
-          <w:p>
-            <w:pPr>
-              <w:pStyle w:val="Header"/>
-              <w:spacing w:before="120" w:after="120"/>
-              <w:rPr>
-                <w:rFonts w:ascii="Times New Roman" w:hAnsi="Times New Roman" w:cs="Times New Roman"/>
-                <w:sz w:val="20"/>
-                <w:szCs w:val="20"/>
-              </w:rPr>
-            </w:pPr>
-            <w:r>
-              <w:rPr>
-                <w:rFonts w:ascii="Times New Roman" w:hAnsi="Times New Roman" w:cs="Times New Roman"/>
-                <w:sz w:val="20"/>
-                <w:szCs w:val="20"/>
-              </w:rPr>
-              <w:t xml:space="preserve">Green: </w:t>
-            </w:r>
-            <w:r>
-              <w:rPr>
-                <w:rFonts w:ascii="Times New Roman" w:hAnsi="Times New Roman" w:cs="Times New Roman"/>
-                <w:sz w:val="20"/>
-                <w:szCs w:val="20"/>
-              </w:rPr>
-              <w:t>631</w:t>
+              <w:t>Red: 519</w:t>
+            </w:r>
+          </w:p>
+          <w:p>
+            <w:pPr>
+              <w:pStyle w:val="Header"/>
+              <w:spacing w:before="120" w:after="120"/>
+              <w:rPr>
+                <w:rFonts w:ascii="Times New Roman" w:hAnsi="Times New Roman" w:cs="Times New Roman"/>
+                <w:sz w:val="20"/>
+                <w:szCs w:val="20"/>
+              </w:rPr>
+            </w:pPr>
+            <w:r>
+              <w:rPr>
+                <w:rFonts w:ascii="Times New Roman" w:hAnsi="Times New Roman" w:cs="Times New Roman"/>
+                <w:sz w:val="20"/>
+                <w:szCs w:val="20"/>
+              </w:rPr>
+              <w:t>Green: 631</w:t>
             </w:r>
           </w:p>
           <w:p>
@@ -2088,79 +2072,7 @@
                 <w:sz w:val="20"/>
                 <w:szCs w:val="20"/>
               </w:rPr>
-              <w:t xml:space="preserve">“Received from: Sensor 1 temp </w:t>
-            </w:r>
-            <w:r>
-              <w:rPr>
-                <w:rFonts w:ascii="Times New Roman" w:hAnsi="Times New Roman" w:cs="Times New Roman"/>
-                <w:sz w:val="20"/>
-                <w:szCs w:val="20"/>
-              </w:rPr>
-              <w:t>26.1</w:t>
-            </w:r>
-            <w:r>
-              <w:rPr>
-                <w:rFonts w:ascii="Times New Roman" w:hAnsi="Times New Roman" w:cs="Times New Roman"/>
-                <w:sz w:val="20"/>
-                <w:szCs w:val="20"/>
-              </w:rPr>
-              <w:t xml:space="preserve"> sound </w:t>
-            </w:r>
-            <w:r>
-              <w:rPr>
-                <w:rFonts w:ascii="Times New Roman" w:hAnsi="Times New Roman" w:cs="Times New Roman"/>
-                <w:sz w:val="20"/>
-                <w:szCs w:val="20"/>
-              </w:rPr>
-              <w:t>35.48</w:t>
-            </w:r>
-            <w:r>
-              <w:rPr>
-                <w:rFonts w:ascii="Times New Roman" w:hAnsi="Times New Roman" w:cs="Times New Roman"/>
-                <w:sz w:val="20"/>
-                <w:szCs w:val="20"/>
-              </w:rPr>
-              <w:t xml:space="preserve"> light </w:t>
-            </w:r>
-            <w:r>
-              <w:rPr>
-                <w:rFonts w:ascii="Times New Roman" w:hAnsi="Times New Roman" w:cs="Times New Roman"/>
-                <w:sz w:val="20"/>
-                <w:szCs w:val="20"/>
-              </w:rPr>
-              <w:t>519, 631, 259, 66</w:t>
-            </w:r>
-            <w:r>
-              <w:rPr>
-                <w:rFonts w:ascii="Times New Roman" w:hAnsi="Times New Roman" w:cs="Times New Roman"/>
-                <w:sz w:val="20"/>
-                <w:szCs w:val="20"/>
-              </w:rPr>
-              <w:t xml:space="preserve"> accessed </w:t>
-            </w:r>
-            <w:r>
-              <w:rPr>
-                <w:rFonts w:ascii="Times New Roman" w:hAnsi="Times New Roman" w:cs="Times New Roman"/>
-                <w:sz w:val="20"/>
-                <w:szCs w:val="20"/>
-              </w:rPr>
-              <w:t>0</w:t>
-            </w:r>
-            <w:r>
-              <w:rPr>
-                <w:rFonts w:ascii="Times New Roman" w:hAnsi="Times New Roman" w:cs="Times New Roman"/>
-                <w:sz w:val="20"/>
-                <w:szCs w:val="20"/>
-              </w:rPr>
-              <w:t xml:space="preserve"> time </w:t>
-            </w:r>
-            <w:r>
-              <w:rPr>
-                <w:rFonts w:ascii="Times New Roman" w:hAnsi="Times New Roman" w:cs="Times New Roman"/>
-                <w:sz w:val="20"/>
-                <w:szCs w:val="20"/>
-              </w:rPr>
-              <w:t>00:00:45</w:t>
+              <w:t>“Received from: Sensor 1 temp 26.1 sound 35.48 light 519, 631, 259, 66 accessed 0 time 00:00:45</w:t>
             </w:r>
             <w:r>
               <w:rPr>
@@ -2396,8 +2308,297 @@
                 <w:sz w:val="20"/>
                 <w:szCs w:val="20"/>
               </w:rPr>
-              <w:t>passed</w:t>
-            </w:r>
+              <w:t>P</w:t>
+            </w:r>
+            <w:r>
+              <w:rPr>
+                <w:rFonts w:ascii="Times New Roman" w:hAnsi="Times New Roman" w:cs="Times New Roman"/>
+                <w:sz w:val="20"/>
+                <w:szCs w:val="20"/>
+              </w:rPr>
+              <w:t>assed</w:t>
+            </w:r>
+            <w:r>
+              <w:rPr>
+                <w:rFonts w:ascii="Times New Roman" w:hAnsi="Times New Roman" w:cs="Times New Roman"/>
+                <w:sz w:val="20"/>
+                <w:szCs w:val="20"/>
+              </w:rPr>
+              <w:t xml:space="preserve"> </w:t>
+            </w:r>
+          </w:p>
+        </w:tc>
+      </w:tr>
+      <w:tr>
+        <w:tc>
+          <w:tcPr>
+            <w:tcW w:w="704" w:type="dxa"/>
+          </w:tcPr>
+          <w:p>
+            <w:pPr>
+              <w:pStyle w:val="Header"/>
+              <w:spacing w:before="120" w:after="120"/>
+              <w:rPr>
+                <w:rFonts w:ascii="Times New Roman" w:hAnsi="Times New Roman" w:cs="Times New Roman"/>
+                <w:sz w:val="20"/>
+                <w:szCs w:val="20"/>
+              </w:rPr>
+            </w:pPr>
+            <w:r>
+              <w:rPr>
+                <w:rFonts w:ascii="Times New Roman" w:hAnsi="Times New Roman" w:cs="Times New Roman"/>
+                <w:sz w:val="20"/>
+                <w:szCs w:val="20"/>
+              </w:rPr>
+              <w:t>1</w:t>
+            </w:r>
+            <w:r>
+              <w:rPr>
+                <w:rFonts w:ascii="Times New Roman" w:hAnsi="Times New Roman" w:cs="Times New Roman"/>
+                <w:sz w:val="20"/>
+                <w:szCs w:val="20"/>
+              </w:rPr>
+              <w:t>0</w:t>
+            </w:r>
+          </w:p>
+        </w:tc>
+        <w:tc>
+          <w:tcPr>
+            <w:tcW w:w="2410" w:type="dxa"/>
+          </w:tcPr>
+          <w:p>
+            <w:pPr>
+              <w:pStyle w:val="Header"/>
+              <w:spacing w:before="120" w:after="120"/>
+              <w:rPr>
+                <w:rFonts w:ascii="Times New Roman" w:hAnsi="Times New Roman" w:cs="Times New Roman"/>
+                <w:sz w:val="20"/>
+                <w:szCs w:val="20"/>
+              </w:rPr>
+            </w:pPr>
+            <w:r>
+              <w:rPr>
+                <w:rFonts w:ascii="Times New Roman" w:hAnsi="Times New Roman" w:cs="Times New Roman"/>
+                <w:sz w:val="20"/>
+                <w:szCs w:val="20"/>
+              </w:rPr>
+              <w:t>The time</w:t>
+            </w:r>
+            <w:r>
+              <w:rPr>
+                <w:rFonts w:ascii="Times New Roman" w:hAnsi="Times New Roman" w:cs="Times New Roman"/>
+                <w:sz w:val="20"/>
+                <w:szCs w:val="20"/>
+              </w:rPr>
+              <w:t xml:space="preserve"> is properly extracted from the sensor data </w:t>
+            </w:r>
+          </w:p>
+          <w:p>
+            <w:pPr>
+              <w:pStyle w:val="Header"/>
+              <w:spacing w:before="120" w:after="120"/>
+              <w:rPr>
+                <w:rFonts w:ascii="Times New Roman" w:hAnsi="Times New Roman" w:cs="Times New Roman"/>
+                <w:sz w:val="20"/>
+                <w:szCs w:val="20"/>
+              </w:rPr>
+            </w:pPr>
+          </w:p>
+        </w:tc>
+        <w:tc>
+          <w:tcPr>
+            <w:tcW w:w="1417" w:type="dxa"/>
+          </w:tcPr>
+          <w:p>
+            <w:pPr>
+              <w:pStyle w:val="Header"/>
+              <w:spacing w:before="120" w:after="120"/>
+              <w:rPr>
+                <w:rFonts w:ascii="Times New Roman" w:hAnsi="Times New Roman" w:cs="Times New Roman"/>
+                <w:sz w:val="20"/>
+                <w:szCs w:val="20"/>
+              </w:rPr>
+            </w:pPr>
+          </w:p>
+        </w:tc>
+        <w:tc>
+          <w:tcPr>
+            <w:tcW w:w="1763" w:type="dxa"/>
+          </w:tcPr>
+          <w:p>
+            <w:pPr>
+              <w:pStyle w:val="Header"/>
+              <w:spacing w:before="120" w:after="120"/>
+              <w:rPr>
+                <w:rFonts w:ascii="Times New Roman" w:hAnsi="Times New Roman" w:cs="Times New Roman"/>
+                <w:sz w:val="20"/>
+                <w:szCs w:val="20"/>
+              </w:rPr>
+            </w:pPr>
+            <w:r>
+              <w:rPr>
+                <w:rFonts w:ascii="Times New Roman" w:hAnsi="Times New Roman" w:cs="Times New Roman"/>
+                <w:sz w:val="20"/>
+                <w:szCs w:val="20"/>
+              </w:rPr>
+              <w:t>Extracted time: *time*</w:t>
+            </w:r>
+          </w:p>
+        </w:tc>
+        <w:tc>
+          <w:tcPr>
+            <w:tcW w:w="1639" w:type="dxa"/>
+          </w:tcPr>
+          <w:p>
+            <w:pPr>
+              <w:pStyle w:val="Header"/>
+              <w:spacing w:before="120" w:after="120"/>
+              <w:rPr>
+                <w:rFonts w:ascii="Times New Roman" w:hAnsi="Times New Roman" w:cs="Times New Roman"/>
+                <w:sz w:val="20"/>
+                <w:szCs w:val="20"/>
+              </w:rPr>
+            </w:pPr>
+            <w:r>
+              <w:rPr>
+                <w:rFonts w:ascii="Times New Roman" w:hAnsi="Times New Roman" w:cs="Times New Roman"/>
+                <w:sz w:val="20"/>
+                <w:szCs w:val="20"/>
+              </w:rPr>
+              <w:t>Extracted time: 00:00:50</w:t>
+            </w:r>
+          </w:p>
+        </w:tc>
+        <w:tc>
+          <w:tcPr>
+            <w:tcW w:w="993" w:type="dxa"/>
+          </w:tcPr>
+          <w:p>
+            <w:pPr>
+              <w:pStyle w:val="Header"/>
+              <w:spacing w:before="120" w:after="120"/>
+              <w:rPr>
+                <w:rFonts w:ascii="Times New Roman" w:hAnsi="Times New Roman" w:cs="Times New Roman"/>
+                <w:sz w:val="20"/>
+                <w:szCs w:val="20"/>
+              </w:rPr>
+            </w:pPr>
+            <w:r>
+              <w:rPr>
+                <w:rFonts w:ascii="Times New Roman" w:hAnsi="Times New Roman" w:cs="Times New Roman"/>
+                <w:sz w:val="20"/>
+                <w:szCs w:val="20"/>
+              </w:rPr>
+              <w:t xml:space="preserve">Passed </w:t>
+            </w:r>
+          </w:p>
+        </w:tc>
+      </w:tr>
+      <w:tr>
+        <w:tc>
+          <w:tcPr>
+            <w:tcW w:w="704" w:type="dxa"/>
+          </w:tcPr>
+          <w:p>
+            <w:pPr>
+              <w:pStyle w:val="Header"/>
+              <w:spacing w:before="120" w:after="120"/>
+              <w:rPr>
+                <w:rFonts w:ascii="Times New Roman" w:hAnsi="Times New Roman" w:cs="Times New Roman"/>
+                <w:sz w:val="20"/>
+                <w:szCs w:val="20"/>
+              </w:rPr>
+            </w:pPr>
+            <w:r>
+              <w:rPr>
+                <w:rFonts w:ascii="Times New Roman" w:hAnsi="Times New Roman" w:cs="Times New Roman"/>
+                <w:sz w:val="20"/>
+                <w:szCs w:val="20"/>
+              </w:rPr>
+              <w:t>11</w:t>
+            </w:r>
+          </w:p>
+        </w:tc>
+        <w:tc>
+          <w:tcPr>
+            <w:tcW w:w="2410" w:type="dxa"/>
+          </w:tcPr>
+          <w:p>
+            <w:pPr>
+              <w:pStyle w:val="Header"/>
+              <w:spacing w:before="120" w:after="120"/>
+              <w:rPr>
+                <w:rFonts w:ascii="Times New Roman" w:hAnsi="Times New Roman" w:cs="Times New Roman"/>
+                <w:sz w:val="20"/>
+                <w:szCs w:val="20"/>
+              </w:rPr>
+            </w:pPr>
+          </w:p>
+        </w:tc>
+        <w:tc>
+          <w:tcPr>
+            <w:tcW w:w="1417" w:type="dxa"/>
+          </w:tcPr>
+          <w:p>
+            <w:pPr>
+              <w:pStyle w:val="Header"/>
+              <w:spacing w:before="120" w:after="120"/>
+              <w:rPr>
+                <w:rFonts w:ascii="Times New Roman" w:hAnsi="Times New Roman" w:cs="Times New Roman"/>
+                <w:sz w:val="20"/>
+                <w:szCs w:val="20"/>
+              </w:rPr>
+            </w:pPr>
+          </w:p>
+        </w:tc>
+        <w:tc>
+          <w:tcPr>
+            <w:tcW w:w="1763" w:type="dxa"/>
+          </w:tcPr>
+          <w:p>
+            <w:pPr>
+              <w:pStyle w:val="Header"/>
+              <w:spacing w:before="120" w:after="120"/>
+              <w:rPr>
+                <w:rFonts w:ascii="Times New Roman" w:hAnsi="Times New Roman" w:cs="Times New Roman"/>
+                <w:sz w:val="20"/>
+                <w:szCs w:val="20"/>
+                <w:lang w:val="en-GB"/>
+              </w:rPr>
+            </w:pPr>
+          </w:p>
+        </w:tc>
+        <w:tc>
+          <w:tcPr>
+            <w:tcW w:w="1639" w:type="dxa"/>
+          </w:tcPr>
+          <w:p>
+            <w:pPr>
+              <w:pStyle w:val="Header"/>
+              <w:spacing w:before="120" w:after="120"/>
+              <w:rPr>
+                <w:rFonts w:ascii="Times New Roman" w:hAnsi="Times New Roman" w:cs="Times New Roman"/>
+                <w:sz w:val="20"/>
+                <w:szCs w:val="20"/>
+                <w:lang w:val="en-GB"/>
+              </w:rPr>
+            </w:pPr>
+          </w:p>
+        </w:tc>
+        <w:tc>
+          <w:tcPr>
+            <w:tcW w:w="993" w:type="dxa"/>
+          </w:tcPr>
+          <w:p>
+            <w:pPr>
+              <w:pStyle w:val="Header"/>
+              <w:spacing w:before="120" w:after="120"/>
+              <w:rPr>
+                <w:rFonts w:ascii="Times New Roman" w:hAnsi="Times New Roman" w:cs="Times New Roman"/>
+                <w:sz w:val="20"/>
+                <w:szCs w:val="20"/>
+              </w:rPr>
+            </w:pPr>
           </w:p>
         </w:tc>
       </w:tr>
@@ -2894,6 +3095,7 @@
   <w:style w:type="character" w:default="1" w:styleId="DefaultParagraphFont">
     <w:name w:val="Default Paragraph Font"/>
     <w:uiPriority w:val="1"/>
+    <w:semiHidden/>
     <w:unhideWhenUsed/>
   </w:style>
   <w:style w:type="table" w:default="1" w:styleId="TableNormal">

</xml_diff>

<commit_message>
idk man i did something
</commit_message>
<xml_diff>
--- a/iEarProject - Styx/test documentation/client to server communication tests.docx
+++ b/iEarProject - Styx/test documentation/client to server communication tests.docx
@@ -424,19 +424,36 @@
                 <w:szCs w:val="20"/>
                 <w:lang w:val="en-GB"/>
               </w:rPr>
-              <w:t>"</w:t>
-            </w:r>
-            <w:proofErr w:type="spellStart"/>
-            <w:r>
+              <w:t>"WiFi access point started: "</w:t>
+            </w:r>
+          </w:p>
+          <w:p>
+            <w:pPr>
+              <w:pStyle w:val="Header"/>
+              <w:spacing w:before="120" w:after="120"/>
+              <w:rPr>
+                <w:rFonts w:ascii="Times New Roman" w:hAnsi="Times New Roman" w:cs="Times New Roman"/>
+                <w:sz w:val="20"/>
+                <w:szCs w:val="20"/>
+              </w:rPr>
+            </w:pPr>
+          </w:p>
+        </w:tc>
+        <w:tc>
+          <w:tcPr>
+            <w:tcW w:w="1639" w:type="dxa"/>
+          </w:tcPr>
+          <w:p>
+            <w:pPr>
+              <w:pStyle w:val="Header"/>
+              <w:spacing w:before="120" w:after="120"/>
               <w:rPr>
                 <w:rFonts w:ascii="Times New Roman" w:hAnsi="Times New Roman" w:cs="Times New Roman"/>
                 <w:sz w:val="20"/>
                 <w:szCs w:val="20"/>
                 <w:lang w:val="en-GB"/>
               </w:rPr>
-              <w:t>WiFi</w:t>
-            </w:r>
-            <w:proofErr w:type="spellEnd"/>
+            </w:pPr>
             <w:r>
               <w:rPr>
                 <w:rFonts w:ascii="Times New Roman" w:hAnsi="Times New Roman" w:cs="Times New Roman"/>
@@ -444,64 +461,7 @@
                 <w:szCs w:val="20"/>
                 <w:lang w:val="en-GB"/>
               </w:rPr>
-              <w:t xml:space="preserve"> access point started: "</w:t>
-            </w:r>
-          </w:p>
-          <w:p>
-            <w:pPr>
-              <w:pStyle w:val="Header"/>
-              <w:spacing w:before="120" w:after="120"/>
-              <w:rPr>
-                <w:rFonts w:ascii="Times New Roman" w:hAnsi="Times New Roman" w:cs="Times New Roman"/>
-                <w:sz w:val="20"/>
-                <w:szCs w:val="20"/>
-              </w:rPr>
-            </w:pPr>
-          </w:p>
-        </w:tc>
-        <w:tc>
-          <w:tcPr>
-            <w:tcW w:w="1639" w:type="dxa"/>
-          </w:tcPr>
-          <w:p>
-            <w:pPr>
-              <w:pStyle w:val="Header"/>
-              <w:spacing w:before="120" w:after="120"/>
-              <w:rPr>
-                <w:rFonts w:ascii="Times New Roman" w:hAnsi="Times New Roman" w:cs="Times New Roman"/>
-                <w:sz w:val="20"/>
-                <w:szCs w:val="20"/>
-                <w:lang w:val="en-GB"/>
-              </w:rPr>
-            </w:pPr>
-            <w:r>
-              <w:rPr>
-                <w:rFonts w:ascii="Times New Roman" w:hAnsi="Times New Roman" w:cs="Times New Roman"/>
-                <w:sz w:val="20"/>
-                <w:szCs w:val="20"/>
-                <w:lang w:val="en-GB"/>
-              </w:rPr>
-              <w:t>"</w:t>
-            </w:r>
-            <w:proofErr w:type="spellStart"/>
-            <w:r>
-              <w:rPr>
-                <w:rFonts w:ascii="Times New Roman" w:hAnsi="Times New Roman" w:cs="Times New Roman"/>
-                <w:sz w:val="20"/>
-                <w:szCs w:val="20"/>
-                <w:lang w:val="en-GB"/>
-              </w:rPr>
-              <w:t>WiFi</w:t>
-            </w:r>
-            <w:proofErr w:type="spellEnd"/>
-            <w:r>
-              <w:rPr>
-                <w:rFonts w:ascii="Times New Roman" w:hAnsi="Times New Roman" w:cs="Times New Roman"/>
-                <w:sz w:val="20"/>
-                <w:szCs w:val="20"/>
-                <w:lang w:val="en-GB"/>
-              </w:rPr>
-              <w:t xml:space="preserve"> access point started: "</w:t>
+              <w:t>"WiFi access point started: "</w:t>
             </w:r>
           </w:p>
           <w:p>
@@ -810,23 +770,13 @@
                 <w:szCs w:val="20"/>
               </w:rPr>
             </w:pPr>
-            <w:proofErr w:type="spellStart"/>
-            <w:r>
-              <w:rPr>
-                <w:rFonts w:ascii="Times New Roman" w:hAnsi="Times New Roman" w:cs="Times New Roman"/>
-                <w:sz w:val="20"/>
-                <w:szCs w:val="20"/>
-              </w:rPr>
-              <w:t>Ssid</w:t>
-            </w:r>
-            <w:proofErr w:type="spellEnd"/>
-            <w:r>
-              <w:rPr>
-                <w:rFonts w:ascii="Times New Roman" w:hAnsi="Times New Roman" w:cs="Times New Roman"/>
-                <w:sz w:val="20"/>
-                <w:szCs w:val="20"/>
-              </w:rPr>
-              <w:t xml:space="preserve"> </w:t>
+            <w:r>
+              <w:rPr>
+                <w:rFonts w:ascii="Times New Roman" w:hAnsi="Times New Roman" w:cs="Times New Roman"/>
+                <w:sz w:val="20"/>
+                <w:szCs w:val="20"/>
+              </w:rPr>
+              <w:t xml:space="preserve">Ssid </w:t>
             </w:r>
           </w:p>
         </w:tc>
@@ -2516,6 +2466,148 @@
                 <w:szCs w:val="20"/>
               </w:rPr>
               <w:t>11</w:t>
+            </w:r>
+          </w:p>
+        </w:tc>
+        <w:tc>
+          <w:tcPr>
+            <w:tcW w:w="2410" w:type="dxa"/>
+          </w:tcPr>
+          <w:p>
+            <w:pPr>
+              <w:pStyle w:val="Header"/>
+              <w:spacing w:before="120" w:after="120"/>
+              <w:rPr>
+                <w:rFonts w:ascii="Times New Roman" w:hAnsi="Times New Roman" w:cs="Times New Roman"/>
+                <w:sz w:val="20"/>
+                <w:szCs w:val="20"/>
+              </w:rPr>
+            </w:pPr>
+            <w:r>
+              <w:rPr>
+                <w:rFonts w:ascii="Times New Roman" w:hAnsi="Times New Roman" w:cs="Times New Roman"/>
+                <w:sz w:val="20"/>
+                <w:szCs w:val="20"/>
+              </w:rPr>
+              <w:t xml:space="preserve">The hour is correctly extracted to be stored in the database </w:t>
+            </w:r>
+          </w:p>
+        </w:tc>
+        <w:tc>
+          <w:tcPr>
+            <w:tcW w:w="1417" w:type="dxa"/>
+          </w:tcPr>
+          <w:p>
+            <w:pPr>
+              <w:pStyle w:val="Header"/>
+              <w:spacing w:before="120" w:after="120"/>
+              <w:rPr>
+                <w:rFonts w:ascii="Times New Roman" w:hAnsi="Times New Roman" w:cs="Times New Roman"/>
+                <w:sz w:val="20"/>
+                <w:szCs w:val="20"/>
+              </w:rPr>
+            </w:pPr>
+          </w:p>
+        </w:tc>
+        <w:tc>
+          <w:tcPr>
+            <w:tcW w:w="1763" w:type="dxa"/>
+          </w:tcPr>
+          <w:p>
+            <w:pPr>
+              <w:pStyle w:val="Header"/>
+              <w:spacing w:before="120" w:after="120"/>
+              <w:rPr>
+                <w:rFonts w:ascii="Times New Roman" w:hAnsi="Times New Roman" w:cs="Times New Roman"/>
+                <w:sz w:val="20"/>
+                <w:szCs w:val="20"/>
+                <w:lang w:val="en-GB"/>
+              </w:rPr>
+            </w:pPr>
+            <w:r>
+              <w:rPr>
+                <w:rFonts w:ascii="Times New Roman" w:hAnsi="Times New Roman" w:cs="Times New Roman"/>
+                <w:sz w:val="20"/>
+                <w:szCs w:val="20"/>
+                <w:lang w:val="en-GB"/>
+              </w:rPr>
+              <w:t>00</w:t>
+            </w:r>
+          </w:p>
+        </w:tc>
+        <w:tc>
+          <w:tcPr>
+            <w:tcW w:w="1639" w:type="dxa"/>
+          </w:tcPr>
+          <w:p>
+            <w:pPr>
+              <w:pStyle w:val="Header"/>
+              <w:spacing w:before="120" w:after="120"/>
+              <w:rPr>
+                <w:rFonts w:ascii="Times New Roman" w:hAnsi="Times New Roman" w:cs="Times New Roman"/>
+                <w:sz w:val="20"/>
+                <w:szCs w:val="20"/>
+                <w:lang w:val="en-GB"/>
+              </w:rPr>
+            </w:pPr>
+            <w:r>
+              <w:rPr>
+                <w:rFonts w:ascii="Times New Roman" w:hAnsi="Times New Roman" w:cs="Times New Roman"/>
+                <w:sz w:val="20"/>
+                <w:szCs w:val="20"/>
+                <w:lang w:val="en-GB"/>
+              </w:rPr>
+              <w:t>00</w:t>
+            </w:r>
+          </w:p>
+        </w:tc>
+        <w:tc>
+          <w:tcPr>
+            <w:tcW w:w="993" w:type="dxa"/>
+          </w:tcPr>
+          <w:p>
+            <w:pPr>
+              <w:pStyle w:val="Header"/>
+              <w:spacing w:before="120" w:after="120"/>
+              <w:rPr>
+                <w:rFonts w:ascii="Times New Roman" w:hAnsi="Times New Roman" w:cs="Times New Roman"/>
+                <w:sz w:val="20"/>
+                <w:szCs w:val="20"/>
+              </w:rPr>
+            </w:pPr>
+            <w:r>
+              <w:rPr>
+                <w:rFonts w:ascii="Times New Roman" w:hAnsi="Times New Roman" w:cs="Times New Roman"/>
+                <w:sz w:val="20"/>
+                <w:szCs w:val="20"/>
+              </w:rPr>
+              <w:t xml:space="preserve">Passed </w:t>
+            </w:r>
+          </w:p>
+        </w:tc>
+      </w:tr>
+      <w:tr>
+        <w:tc>
+          <w:tcPr>
+            <w:tcW w:w="704" w:type="dxa"/>
+          </w:tcPr>
+          <w:p>
+            <w:pPr>
+              <w:pStyle w:val="Header"/>
+              <w:spacing w:before="120" w:after="120"/>
+              <w:rPr>
+                <w:rFonts w:ascii="Times New Roman" w:hAnsi="Times New Roman" w:cs="Times New Roman"/>
+                <w:sz w:val="20"/>
+                <w:szCs w:val="20"/>
+              </w:rPr>
+            </w:pPr>
+            <w:r>
+              <w:rPr>
+                <w:rFonts w:ascii="Times New Roman" w:hAnsi="Times New Roman" w:cs="Times New Roman"/>
+                <w:sz w:val="20"/>
+                <w:szCs w:val="20"/>
+              </w:rPr>
+              <w:t>12</w:t>
             </w:r>
           </w:p>
         </w:tc>

</xml_diff>

<commit_message>
hourly history now implemented
</commit_message>
<xml_diff>
--- a/iEarProject - Styx/test documentation/client to server communication tests.docx
+++ b/iEarProject - Styx/test documentation/client to server communication tests.docx
@@ -424,7 +424,27 @@
                 <w:szCs w:val="20"/>
                 <w:lang w:val="en-GB"/>
               </w:rPr>
-              <w:t>"WiFi access point started: "</w:t>
+              <w:t>"</w:t>
+            </w:r>
+            <w:proofErr w:type="spellStart"/>
+            <w:r>
+              <w:rPr>
+                <w:rFonts w:ascii="Times New Roman" w:hAnsi="Times New Roman" w:cs="Times New Roman"/>
+                <w:sz w:val="20"/>
+                <w:szCs w:val="20"/>
+                <w:lang w:val="en-GB"/>
+              </w:rPr>
+              <w:t>WiFi</w:t>
+            </w:r>
+            <w:proofErr w:type="spellEnd"/>
+            <w:r>
+              <w:rPr>
+                <w:rFonts w:ascii="Times New Roman" w:hAnsi="Times New Roman" w:cs="Times New Roman"/>
+                <w:sz w:val="20"/>
+                <w:szCs w:val="20"/>
+                <w:lang w:val="en-GB"/>
+              </w:rPr>
+              <w:t xml:space="preserve"> access point started: "</w:t>
             </w:r>
           </w:p>
           <w:p>
@@ -461,7 +481,27 @@
                 <w:szCs w:val="20"/>
                 <w:lang w:val="en-GB"/>
               </w:rPr>
-              <w:t>"WiFi access point started: "</w:t>
+              <w:t>"</w:t>
+            </w:r>
+            <w:proofErr w:type="spellStart"/>
+            <w:r>
+              <w:rPr>
+                <w:rFonts w:ascii="Times New Roman" w:hAnsi="Times New Roman" w:cs="Times New Roman"/>
+                <w:sz w:val="20"/>
+                <w:szCs w:val="20"/>
+                <w:lang w:val="en-GB"/>
+              </w:rPr>
+              <w:t>WiFi</w:t>
+            </w:r>
+            <w:proofErr w:type="spellEnd"/>
+            <w:r>
+              <w:rPr>
+                <w:rFonts w:ascii="Times New Roman" w:hAnsi="Times New Roman" w:cs="Times New Roman"/>
+                <w:sz w:val="20"/>
+                <w:szCs w:val="20"/>
+                <w:lang w:val="en-GB"/>
+              </w:rPr>
+              <w:t xml:space="preserve"> access point started: "</w:t>
             </w:r>
           </w:p>
           <w:p>
@@ -770,13 +810,23 @@
                 <w:szCs w:val="20"/>
               </w:rPr>
             </w:pPr>
-            <w:r>
-              <w:rPr>
-                <w:rFonts w:ascii="Times New Roman" w:hAnsi="Times New Roman" w:cs="Times New Roman"/>
-                <w:sz w:val="20"/>
-                <w:szCs w:val="20"/>
-              </w:rPr>
-              <w:t xml:space="preserve">Ssid </w:t>
+            <w:proofErr w:type="spellStart"/>
+            <w:r>
+              <w:rPr>
+                <w:rFonts w:ascii="Times New Roman" w:hAnsi="Times New Roman" w:cs="Times New Roman"/>
+                <w:sz w:val="20"/>
+                <w:szCs w:val="20"/>
+              </w:rPr>
+              <w:t>Ssid</w:t>
+            </w:r>
+            <w:proofErr w:type="spellEnd"/>
+            <w:r>
+              <w:rPr>
+                <w:rFonts w:ascii="Times New Roman" w:hAnsi="Times New Roman" w:cs="Times New Roman"/>
+                <w:sz w:val="20"/>
+                <w:szCs w:val="20"/>
+              </w:rPr>
+              <w:t xml:space="preserve"> </w:t>
             </w:r>
           </w:p>
         </w:tc>
@@ -1449,8 +1499,18 @@
                 <w:sz w:val="20"/>
                 <w:szCs w:val="20"/>
               </w:rPr>
-              <w:t>“Light measurements..</w:t>
-            </w:r>
+              <w:t xml:space="preserve">“Light </w:t>
+            </w:r>
+            <w:proofErr w:type="gramStart"/>
+            <w:r>
+              <w:rPr>
+                <w:rFonts w:ascii="Times New Roman" w:hAnsi="Times New Roman" w:cs="Times New Roman"/>
+                <w:sz w:val="20"/>
+                <w:szCs w:val="20"/>
+              </w:rPr>
+              <w:t>measurements..</w:t>
+            </w:r>
+            <w:proofErr w:type="gramEnd"/>
           </w:p>
           <w:p>
             <w:pPr>
@@ -1557,8 +1617,18 @@
                 <w:sz w:val="20"/>
                 <w:szCs w:val="20"/>
               </w:rPr>
-              <w:t>“Light measurements..</w:t>
-            </w:r>
+              <w:t xml:space="preserve">“Light </w:t>
+            </w:r>
+            <w:proofErr w:type="gramStart"/>
+            <w:r>
+              <w:rPr>
+                <w:rFonts w:ascii="Times New Roman" w:hAnsi="Times New Roman" w:cs="Times New Roman"/>
+                <w:sz w:val="20"/>
+                <w:szCs w:val="20"/>
+              </w:rPr>
+              <w:t>measurements..</w:t>
+            </w:r>
+            <w:proofErr w:type="gramEnd"/>
           </w:p>
           <w:p>
             <w:pPr>
@@ -1731,7 +1801,25 @@
                 <w:sz w:val="20"/>
                 <w:szCs w:val="20"/>
               </w:rPr>
-              <w:t xml:space="preserve">The client can detect is its “object” has been accessed in the classroom </w:t>
+              <w:t xml:space="preserve">The client can detect </w:t>
+            </w:r>
+            <w:proofErr w:type="gramStart"/>
+            <w:r>
+              <w:rPr>
+                <w:rFonts w:ascii="Times New Roman" w:hAnsi="Times New Roman" w:cs="Times New Roman"/>
+                <w:sz w:val="20"/>
+                <w:szCs w:val="20"/>
+              </w:rPr>
+              <w:t>is</w:t>
+            </w:r>
+            <w:proofErr w:type="gramEnd"/>
+            <w:r>
+              <w:rPr>
+                <w:rFonts w:ascii="Times New Roman" w:hAnsi="Times New Roman" w:cs="Times New Roman"/>
+                <w:sz w:val="20"/>
+                <w:szCs w:val="20"/>
+              </w:rPr>
+              <w:t xml:space="preserve"> its “object” has been accessed in the classroom </w:t>
             </w:r>
           </w:p>
           <w:p>
@@ -2022,7 +2110,25 @@
                 <w:sz w:val="20"/>
                 <w:szCs w:val="20"/>
               </w:rPr>
-              <w:t>“Received from: Sensor 1 temp 26.1 sound 35.48 light 519, 631, 259, 66 accessed 0 time 00:00:45</w:t>
+              <w:t xml:space="preserve">“Received from: Sensor 1 temp 26.1 sound 35.48 light 519, 631, 259, 66 accessed 0 </w:t>
+            </w:r>
+            <w:proofErr w:type="gramStart"/>
+            <w:r>
+              <w:rPr>
+                <w:rFonts w:ascii="Times New Roman" w:hAnsi="Times New Roman" w:cs="Times New Roman"/>
+                <w:sz w:val="20"/>
+                <w:szCs w:val="20"/>
+              </w:rPr>
+              <w:t>time</w:t>
+            </w:r>
+            <w:proofErr w:type="gramEnd"/>
+            <w:r>
+              <w:rPr>
+                <w:rFonts w:ascii="Times New Roman" w:hAnsi="Times New Roman" w:cs="Times New Roman"/>
+                <w:sz w:val="20"/>
+                <w:szCs w:val="20"/>
+              </w:rPr>
+              <w:t xml:space="preserve"> 00:00:45</w:t>
             </w:r>
             <w:r>
               <w:rPr>
@@ -2531,7 +2637,7 @@
                 <w:szCs w:val="20"/>
                 <w:lang w:val="en-GB"/>
               </w:rPr>
-              <w:t>00</w:t>
+              <w:t>0</w:t>
             </w:r>
           </w:p>
         </w:tc>
@@ -2557,7 +2663,7 @@
                 <w:szCs w:val="20"/>
                 <w:lang w:val="en-GB"/>
               </w:rPr>
-              <w:t>00</w:t>
+              <w:t>0</w:t>
             </w:r>
           </w:p>
         </w:tc>
@@ -2625,6 +2731,32 @@
                 <w:szCs w:val="20"/>
               </w:rPr>
             </w:pPr>
+            <w:r>
+              <w:rPr>
+                <w:rFonts w:ascii="Times New Roman" w:hAnsi="Times New Roman" w:cs="Times New Roman"/>
+                <w:sz w:val="20"/>
+                <w:szCs w:val="20"/>
+              </w:rPr>
+              <w:t xml:space="preserve">The system shall get the temp, light, sound and accessed readings </w:t>
+            </w:r>
+            <w:proofErr w:type="gramStart"/>
+            <w:r>
+              <w:rPr>
+                <w:rFonts w:ascii="Times New Roman" w:hAnsi="Times New Roman" w:cs="Times New Roman"/>
+                <w:sz w:val="20"/>
+                <w:szCs w:val="20"/>
+              </w:rPr>
+              <w:t>in order to</w:t>
+            </w:r>
+            <w:proofErr w:type="gramEnd"/>
+            <w:r>
+              <w:rPr>
+                <w:rFonts w:ascii="Times New Roman" w:hAnsi="Times New Roman" w:cs="Times New Roman"/>
+                <w:sz w:val="20"/>
+                <w:szCs w:val="20"/>
+              </w:rPr>
+              <w:t xml:space="preserve"> store them separately per hour </w:t>
+            </w:r>
           </w:p>
         </w:tc>
         <w:tc>
@@ -2658,6 +2790,99 @@
                 <w:lang w:val="en-GB"/>
               </w:rPr>
             </w:pPr>
+            <w:r>
+              <w:rPr>
+                <w:rFonts w:ascii="Times New Roman" w:hAnsi="Times New Roman" w:cs="Times New Roman"/>
+                <w:sz w:val="20"/>
+                <w:szCs w:val="20"/>
+                <w:lang w:val="en-GB"/>
+              </w:rPr>
+              <w:t>time: 00:00:44</w:t>
+            </w:r>
+          </w:p>
+          <w:p>
+            <w:pPr>
+              <w:pStyle w:val="Header"/>
+              <w:spacing w:before="120" w:after="120"/>
+              <w:rPr>
+                <w:rFonts w:ascii="Times New Roman" w:hAnsi="Times New Roman" w:cs="Times New Roman"/>
+                <w:sz w:val="20"/>
+                <w:szCs w:val="20"/>
+                <w:lang w:val="en-GB"/>
+              </w:rPr>
+            </w:pPr>
+            <w:r>
+              <w:rPr>
+                <w:rFonts w:ascii="Times New Roman" w:hAnsi="Times New Roman" w:cs="Times New Roman"/>
+                <w:sz w:val="20"/>
+                <w:szCs w:val="20"/>
+                <w:lang w:val="en-GB"/>
+              </w:rPr>
+              <w:t>temp: 20.19</w:t>
+            </w:r>
+          </w:p>
+          <w:p>
+            <w:pPr>
+              <w:pStyle w:val="Header"/>
+              <w:spacing w:before="120" w:after="120"/>
+              <w:rPr>
+                <w:rFonts w:ascii="Times New Roman" w:hAnsi="Times New Roman" w:cs="Times New Roman"/>
+                <w:sz w:val="20"/>
+                <w:szCs w:val="20"/>
+                <w:lang w:val="en-GB"/>
+              </w:rPr>
+            </w:pPr>
+            <w:r>
+              <w:rPr>
+                <w:rFonts w:ascii="Times New Roman" w:hAnsi="Times New Roman" w:cs="Times New Roman"/>
+                <w:sz w:val="20"/>
+                <w:szCs w:val="20"/>
+                <w:lang w:val="en-GB"/>
+              </w:rPr>
+              <w:t>sound: 32.37</w:t>
+            </w:r>
+          </w:p>
+          <w:p>
+            <w:pPr>
+              <w:pStyle w:val="Header"/>
+              <w:spacing w:before="120" w:after="120"/>
+              <w:rPr>
+                <w:rFonts w:ascii="Times New Roman" w:hAnsi="Times New Roman" w:cs="Times New Roman"/>
+                <w:sz w:val="20"/>
+                <w:szCs w:val="20"/>
+                <w:lang w:val="en-GB"/>
+              </w:rPr>
+            </w:pPr>
+            <w:r>
+              <w:rPr>
+                <w:rFonts w:ascii="Times New Roman" w:hAnsi="Times New Roman" w:cs="Times New Roman"/>
+                <w:sz w:val="20"/>
+                <w:szCs w:val="20"/>
+                <w:lang w:val="en-GB"/>
+              </w:rPr>
+              <w:t>light: 267,364,174,37</w:t>
+            </w:r>
+          </w:p>
+          <w:p>
+            <w:pPr>
+              <w:pStyle w:val="Header"/>
+              <w:spacing w:before="120" w:after="120"/>
+              <w:rPr>
+                <w:rFonts w:ascii="Times New Roman" w:hAnsi="Times New Roman" w:cs="Times New Roman"/>
+                <w:sz w:val="20"/>
+                <w:szCs w:val="20"/>
+                <w:lang w:val="en-GB"/>
+              </w:rPr>
+            </w:pPr>
+            <w:r>
+              <w:rPr>
+                <w:rFonts w:ascii="Times New Roman" w:hAnsi="Times New Roman" w:cs="Times New Roman"/>
+                <w:sz w:val="20"/>
+                <w:szCs w:val="20"/>
+                <w:lang w:val="en-GB"/>
+              </w:rPr>
+              <w:t>accessed: 0</w:t>
+            </w:r>
           </w:p>
         </w:tc>
         <w:tc>
@@ -2675,6 +2900,99 @@
                 <w:lang w:val="en-GB"/>
               </w:rPr>
             </w:pPr>
+            <w:r>
+              <w:rPr>
+                <w:rFonts w:ascii="Times New Roman" w:hAnsi="Times New Roman" w:cs="Times New Roman"/>
+                <w:sz w:val="20"/>
+                <w:szCs w:val="20"/>
+                <w:lang w:val="en-GB"/>
+              </w:rPr>
+              <w:t>time: 00:00:44</w:t>
+            </w:r>
+          </w:p>
+          <w:p>
+            <w:pPr>
+              <w:pStyle w:val="Header"/>
+              <w:spacing w:before="120" w:after="120"/>
+              <w:rPr>
+                <w:rFonts w:ascii="Times New Roman" w:hAnsi="Times New Roman" w:cs="Times New Roman"/>
+                <w:sz w:val="20"/>
+                <w:szCs w:val="20"/>
+                <w:lang w:val="en-GB"/>
+              </w:rPr>
+            </w:pPr>
+            <w:r>
+              <w:rPr>
+                <w:rFonts w:ascii="Times New Roman" w:hAnsi="Times New Roman" w:cs="Times New Roman"/>
+                <w:sz w:val="20"/>
+                <w:szCs w:val="20"/>
+                <w:lang w:val="en-GB"/>
+              </w:rPr>
+              <w:t>temp: 20.19</w:t>
+            </w:r>
+          </w:p>
+          <w:p>
+            <w:pPr>
+              <w:pStyle w:val="Header"/>
+              <w:spacing w:before="120" w:after="120"/>
+              <w:rPr>
+                <w:rFonts w:ascii="Times New Roman" w:hAnsi="Times New Roman" w:cs="Times New Roman"/>
+                <w:sz w:val="20"/>
+                <w:szCs w:val="20"/>
+                <w:lang w:val="en-GB"/>
+              </w:rPr>
+            </w:pPr>
+            <w:r>
+              <w:rPr>
+                <w:rFonts w:ascii="Times New Roman" w:hAnsi="Times New Roman" w:cs="Times New Roman"/>
+                <w:sz w:val="20"/>
+                <w:szCs w:val="20"/>
+                <w:lang w:val="en-GB"/>
+              </w:rPr>
+              <w:t>sound: 32.37</w:t>
+            </w:r>
+          </w:p>
+          <w:p>
+            <w:pPr>
+              <w:pStyle w:val="Header"/>
+              <w:spacing w:before="120" w:after="120"/>
+              <w:rPr>
+                <w:rFonts w:ascii="Times New Roman" w:hAnsi="Times New Roman" w:cs="Times New Roman"/>
+                <w:sz w:val="20"/>
+                <w:szCs w:val="20"/>
+                <w:lang w:val="en-GB"/>
+              </w:rPr>
+            </w:pPr>
+            <w:r>
+              <w:rPr>
+                <w:rFonts w:ascii="Times New Roman" w:hAnsi="Times New Roman" w:cs="Times New Roman"/>
+                <w:sz w:val="20"/>
+                <w:szCs w:val="20"/>
+                <w:lang w:val="en-GB"/>
+              </w:rPr>
+              <w:t>light: 267,364,174,37</w:t>
+            </w:r>
+          </w:p>
+          <w:p>
+            <w:pPr>
+              <w:pStyle w:val="Header"/>
+              <w:spacing w:before="120" w:after="120"/>
+              <w:rPr>
+                <w:rFonts w:ascii="Times New Roman" w:hAnsi="Times New Roman" w:cs="Times New Roman"/>
+                <w:sz w:val="20"/>
+                <w:szCs w:val="20"/>
+                <w:lang w:val="en-GB"/>
+              </w:rPr>
+            </w:pPr>
+            <w:r>
+              <w:rPr>
+                <w:rFonts w:ascii="Times New Roman" w:hAnsi="Times New Roman" w:cs="Times New Roman"/>
+                <w:sz w:val="20"/>
+                <w:szCs w:val="20"/>
+                <w:lang w:val="en-GB"/>
+              </w:rPr>
+              <w:t>accessed: 0</w:t>
+            </w:r>
           </w:p>
         </w:tc>
         <w:tc>
@@ -2691,6 +3009,14 @@
                 <w:szCs w:val="20"/>
               </w:rPr>
             </w:pPr>
+            <w:r>
+              <w:rPr>
+                <w:rFonts w:ascii="Times New Roman" w:hAnsi="Times New Roman" w:cs="Times New Roman"/>
+                <w:sz w:val="20"/>
+                <w:szCs w:val="20"/>
+              </w:rPr>
+              <w:t xml:space="preserve">Passed </w:t>
+            </w:r>
           </w:p>
         </w:tc>
       </w:tr>

</xml_diff>